<commit_message>
ad lot of cleanup, renaming and make all parameteres in sync. also updated documents
</commit_message>
<xml_diff>
--- a/blueboot_agency_power_agent/docs/BlueSearch_Pipeline_Reference.docx
+++ b/blueboot_agency_power_agent/docs/BlueSearch_Pipeline_Reference.docx
@@ -3410,7 +3410,7 @@
                 <w:sz w:val="20"/>
                 <w:szCs w:val="20"/>
               </w:rPr>
-              <w:t xml:space="preserve">6 — Export</w:t>
+              <w:t xml:space="preserve">6 — Export + write</w:t>
             </w:r>
           </w:p>
         </w:tc>
@@ -3438,7 +3438,7 @@
                 <w:sz w:val="20"/>
                 <w:szCs w:val="20"/>
               </w:rPr>
-              <w:t xml:space="preserve">site_smart_export.py</w:t>
+              <w:t xml:space="preserve">site_smart_export.py --write-contacts</w:t>
             </w:r>
           </w:p>
         </w:tc>
@@ -3466,93 +3466,7 @@
                 <w:sz w:val="20"/>
                 <w:szCs w:val="20"/>
               </w:rPr>
-              <w:t xml:space="preserve">Tiered Excel (6 tiers by page count)</w:t>
-            </w:r>
-          </w:p>
-        </w:tc>
-      </w:tr>
-      <w:tr>
-        <w:tc>
-          <w:tcPr>
-            <w:tcW w:type="dxa" w:w="1200"/>
-            <w:tcBorders>
-              <w:top w:val="single" w:color="CCCCCC" w:sz="4"/>
-              <w:left w:val="single" w:color="CCCCCC" w:sz="4"/>
-              <w:bottom w:val="single" w:color="CCCCCC" w:sz="4"/>
-              <w:right w:val="single" w:color="CCCCCC" w:sz="4"/>
-            </w:tcBorders>
-            <w:shd w:fill="FFFFFF" w:val="clear"/>
-            <w:tcMar>
-              <w:top w:type="dxa" w:w="80"/>
-              <w:left w:type="dxa" w:w="120"/>
-              <w:bottom w:type="dxa" w:w="80"/>
-              <w:right w:type="dxa" w:w="120"/>
-            </w:tcMar>
-          </w:tcPr>
-          <w:p>
-            <w:r>
-              <w:rPr>
-                <w:rFonts w:ascii="Arial" w:cs="Arial" w:eastAsia="Arial" w:hAnsi="Arial"/>
-                <w:sz w:val="20"/>
-                <w:szCs w:val="20"/>
-              </w:rPr>
-              <w:t xml:space="preserve">7 — Write contacts</w:t>
-            </w:r>
-          </w:p>
-        </w:tc>
-        <w:tc>
-          <w:tcPr>
-            <w:tcW w:type="dxa" w:w="2200"/>
-            <w:tcBorders>
-              <w:top w:val="single" w:color="CCCCCC" w:sz="4"/>
-              <w:left w:val="single" w:color="CCCCCC" w:sz="4"/>
-              <w:bottom w:val="single" w:color="CCCCCC" w:sz="4"/>
-              <w:right w:val="single" w:color="CCCCCC" w:sz="4"/>
-            </w:tcBorders>
-            <w:shd w:fill="FFFFFF" w:val="clear"/>
-            <w:tcMar>
-              <w:top w:type="dxa" w:w="80"/>
-              <w:left w:type="dxa" w:w="120"/>
-              <w:bottom w:type="dxa" w:w="80"/>
-              <w:right w:type="dxa" w:w="120"/>
-            </w:tcMar>
-          </w:tcPr>
-          <w:p>
-            <w:r>
-              <w:rPr>
-                <w:rFonts w:ascii="Arial" w:cs="Arial" w:eastAsia="Arial" w:hAnsi="Arial"/>
-                <w:sz w:val="20"/>
-                <w:szCs w:val="20"/>
-              </w:rPr>
-              <w:t xml:space="preserve">--write-contacts --campaign NAME</w:t>
-            </w:r>
-          </w:p>
-        </w:tc>
-        <w:tc>
-          <w:tcPr>
-            <w:tcW w:type="dxa" w:w="5960"/>
-            <w:tcBorders>
-              <w:top w:val="single" w:color="CCCCCC" w:sz="4"/>
-              <w:left w:val="single" w:color="CCCCCC" w:sz="4"/>
-              <w:bottom w:val="single" w:color="CCCCCC" w:sz="4"/>
-              <w:right w:val="single" w:color="CCCCCC" w:sz="4"/>
-            </w:tcBorders>
-            <w:shd w:fill="FFFFFF" w:val="clear"/>
-            <w:tcMar>
-              <w:top w:type="dxa" w:w="80"/>
-              <w:left w:type="dxa" w:w="120"/>
-              <w:bottom w:type="dxa" w:w="80"/>
-              <w:right w:type="dxa" w:w="120"/>
-            </w:tcMar>
-          </w:tcPr>
-          <w:p>
-            <w:r>
-              <w:rPr>
-                <w:rFonts w:ascii="Arial" w:cs="Arial" w:eastAsia="Arial" w:hAnsi="Arial"/>
-                <w:sz w:val="20"/>
-                <w:szCs w:val="20"/>
-              </w:rPr>
-              <w:t xml:space="preserve">Writes to email_contacts with mark_site_leads=true</w:t>
+              <w:t xml:space="preserve">Tiered Excel + writes to email_contacts with mark_site_leads=true</w:t>
             </w:r>
           </w:p>
         </w:tc>
@@ -21902,6 +21816,1512 @@
         <w:t xml:space="preserve"/>
       </w:r>
     </w:p>
+    <w:p>
+      <w:pPr>
+        <w:pageBreakBefore/>
+      </w:pPr>
+      <w:r>
+        <w:t xml:space="preserve"/>
+      </w:r>
+    </w:p>
+    <w:p>
+      <w:pPr>
+        <w:pStyle w:val="Heading1"/>
+      </w:pPr>
+      <w:r>
+        <w:rPr>
+          <w:rFonts w:ascii="Arial" w:cs="Arial" w:eastAsia="Arial" w:hAnsi="Arial"/>
+          <w:b/>
+          <w:bCs/>
+          <w:color w:val="1F497D"/>
+          <w:sz w:val="32"/>
+          <w:szCs w:val="32"/>
+        </w:rPr>
+        <w:t xml:space="preserve">8. Lead Pipeline — Corrected Step Order</w:t>
+      </w:r>
+    </w:p>
+    <w:p>
+      <w:pPr>
+        <w:spacing w:after="120"/>
+      </w:pPr>
+      <w:r>
+        <w:rPr>
+          <w:rFonts w:ascii="Arial" w:cs="Arial" w:eastAsia="Arial" w:hAnsi="Arial"/>
+          <w:sz w:val="22"/>
+          <w:szCs w:val="22"/>
+        </w:rPr>
+        <w:t xml:space="preserve">leads_email_check.py has been restored to the active Lead Pipeline as step 4 — equivalent to site_email_check.py in the Site Pipeline. It classifies contact email type, contact role, and sets outreach_priority 1–4.</w:t>
+      </w:r>
+    </w:p>
+    <w:p>
+      <w:r>
+        <w:t xml:space="preserve"/>
+      </w:r>
+    </w:p>
+    <w:p>
+      <w:pPr>
+        <w:pStyle w:val="Heading2"/>
+      </w:pPr>
+      <w:r>
+        <w:rPr>
+          <w:rFonts w:ascii="Arial" w:cs="Arial" w:eastAsia="Arial" w:hAnsi="Arial"/>
+          <w:b/>
+          <w:bCs/>
+          <w:sz w:val="26"/>
+          <w:szCs w:val="26"/>
+        </w:rPr>
+        <w:t xml:space="preserve">Corrected Lead Pipeline Steps</w:t>
+      </w:r>
+    </w:p>
+    <w:p>
+      <w:r>
+        <w:t xml:space="preserve"/>
+      </w:r>
+    </w:p>
+    <w:tbl>
+      <w:tblPr>
+        <w:tblW w:type="dxa" w:w="9360"/>
+        <w:tblBorders>
+          <w:top w:val="single" w:color="auto" w:sz="4"/>
+          <w:left w:val="single" w:color="auto" w:sz="4"/>
+          <w:bottom w:val="single" w:color="auto" w:sz="4"/>
+          <w:right w:val="single" w:color="auto" w:sz="4"/>
+          <w:insideH w:val="single" w:color="auto" w:sz="4"/>
+          <w:insideV w:val="single" w:color="auto" w:sz="4"/>
+        </w:tblBorders>
+      </w:tblPr>
+      <w:tblGrid>
+        <w:gridCol w:w="1200"/>
+        <w:gridCol w:w="2400"/>
+        <w:gridCol w:w="5760"/>
+      </w:tblGrid>
+      <w:tr>
+        <w:trPr>
+          <w:tblHeader/>
+        </w:trPr>
+        <w:tc>
+          <w:tcPr>
+            <w:tcW w:type="dxa" w:w="1200"/>
+            <w:tcBorders>
+              <w:top w:val="single" w:color="1F497D" w:sz="4"/>
+              <w:left w:val="single" w:color="1F497D" w:sz="4"/>
+              <w:bottom w:val="single" w:color="1F497D" w:sz="4"/>
+              <w:right w:val="single" w:color="1F497D" w:sz="4"/>
+            </w:tcBorders>
+            <w:shd w:fill="1F497D" w:val="clear"/>
+            <w:tcMar>
+              <w:top w:type="dxa" w:w="80"/>
+              <w:left w:type="dxa" w:w="120"/>
+              <w:bottom w:type="dxa" w:w="80"/>
+              <w:right w:type="dxa" w:w="120"/>
+            </w:tcMar>
+          </w:tcPr>
+          <w:p>
+            <w:pPr>
+              <w:jc w:val="center"/>
+            </w:pPr>
+            <w:r>
+              <w:rPr>
+                <w:rFonts w:ascii="Arial" w:cs="Arial" w:eastAsia="Arial" w:hAnsi="Arial"/>
+                <w:b/>
+                <w:bCs/>
+                <w:color w:val="FFFFFF"/>
+                <w:sz w:val="20"/>
+                <w:szCs w:val="20"/>
+              </w:rPr>
+              <w:t xml:space="preserve">Step</w:t>
+            </w:r>
+          </w:p>
+        </w:tc>
+        <w:tc>
+          <w:tcPr>
+            <w:tcW w:type="dxa" w:w="2400"/>
+            <w:tcBorders>
+              <w:top w:val="single" w:color="1F497D" w:sz="4"/>
+              <w:left w:val="single" w:color="1F497D" w:sz="4"/>
+              <w:bottom w:val="single" w:color="1F497D" w:sz="4"/>
+              <w:right w:val="single" w:color="1F497D" w:sz="4"/>
+            </w:tcBorders>
+            <w:shd w:fill="1F497D" w:val="clear"/>
+            <w:tcMar>
+              <w:top w:type="dxa" w:w="80"/>
+              <w:left w:type="dxa" w:w="120"/>
+              <w:bottom w:type="dxa" w:w="80"/>
+              <w:right w:type="dxa" w:w="120"/>
+            </w:tcMar>
+          </w:tcPr>
+          <w:p>
+            <w:pPr>
+              <w:jc w:val="center"/>
+            </w:pPr>
+            <w:r>
+              <w:rPr>
+                <w:rFonts w:ascii="Arial" w:cs="Arial" w:eastAsia="Arial" w:hAnsi="Arial"/>
+                <w:b/>
+                <w:bCs/>
+                <w:color w:val="FFFFFF"/>
+                <w:sz w:val="20"/>
+                <w:szCs w:val="20"/>
+              </w:rPr>
+              <w:t xml:space="preserve">Script</w:t>
+            </w:r>
+          </w:p>
+        </w:tc>
+        <w:tc>
+          <w:tcPr>
+            <w:tcW w:type="dxa" w:w="5760"/>
+            <w:tcBorders>
+              <w:top w:val="single" w:color="1F497D" w:sz="4"/>
+              <w:left w:val="single" w:color="1F497D" w:sz="4"/>
+              <w:bottom w:val="single" w:color="1F497D" w:sz="4"/>
+              <w:right w:val="single" w:color="1F497D" w:sz="4"/>
+            </w:tcBorders>
+            <w:shd w:fill="1F497D" w:val="clear"/>
+            <w:tcMar>
+              <w:top w:type="dxa" w:w="80"/>
+              <w:left w:type="dxa" w:w="120"/>
+              <w:bottom w:type="dxa" w:w="80"/>
+              <w:right w:type="dxa" w:w="120"/>
+            </w:tcMar>
+          </w:tcPr>
+          <w:p>
+            <w:pPr>
+              <w:jc w:val="center"/>
+            </w:pPr>
+            <w:r>
+              <w:rPr>
+                <w:rFonts w:ascii="Arial" w:cs="Arial" w:eastAsia="Arial" w:hAnsi="Arial"/>
+                <w:b/>
+                <w:bCs/>
+                <w:color w:val="FFFFFF"/>
+                <w:sz w:val="20"/>
+                <w:szCs w:val="20"/>
+              </w:rPr>
+              <w:t xml:space="preserve">Output / Notes</w:t>
+            </w:r>
+          </w:p>
+        </w:tc>
+      </w:tr>
+      <w:tr>
+        <w:tc>
+          <w:tcPr>
+            <w:tcW w:type="dxa" w:w="1200"/>
+            <w:tcBorders>
+              <w:top w:val="single" w:color="CCCCCC" w:sz="4"/>
+              <w:left w:val="single" w:color="CCCCCC" w:sz="4"/>
+              <w:bottom w:val="single" w:color="CCCCCC" w:sz="4"/>
+              <w:right w:val="single" w:color="CCCCCC" w:sz="4"/>
+            </w:tcBorders>
+            <w:shd w:fill="FFFFFF" w:val="clear"/>
+            <w:tcMar>
+              <w:top w:type="dxa" w:w="80"/>
+              <w:left w:type="dxa" w:w="120"/>
+              <w:bottom w:type="dxa" w:w="80"/>
+              <w:right w:type="dxa" w:w="120"/>
+            </w:tcMar>
+          </w:tcPr>
+          <w:p>
+            <w:r>
+              <w:rPr>
+                <w:rFonts w:ascii="Arial" w:cs="Arial" w:eastAsia="Arial" w:hAnsi="Arial"/>
+                <w:sz w:val="20"/>
+                <w:szCs w:val="20"/>
+              </w:rPr>
+              <w:t xml:space="preserve">1 — Discover</w:t>
+            </w:r>
+          </w:p>
+        </w:tc>
+        <w:tc>
+          <w:tcPr>
+            <w:tcW w:type="dxa" w:w="2400"/>
+            <w:tcBorders>
+              <w:top w:val="single" w:color="CCCCCC" w:sz="4"/>
+              <w:left w:val="single" w:color="CCCCCC" w:sz="4"/>
+              <w:bottom w:val="single" w:color="CCCCCC" w:sz="4"/>
+              <w:right w:val="single" w:color="CCCCCC" w:sz="4"/>
+            </w:tcBorders>
+            <w:shd w:fill="FFFFFF" w:val="clear"/>
+            <w:tcMar>
+              <w:top w:type="dxa" w:w="80"/>
+              <w:left w:type="dxa" w:w="120"/>
+              <w:bottom w:type="dxa" w:w="80"/>
+              <w:right w:type="dxa" w:w="120"/>
+            </w:tcMar>
+          </w:tcPr>
+          <w:p>
+            <w:r>
+              <w:rPr>
+                <w:rFonts w:ascii="Arial" w:cs="Arial" w:eastAsia="Arial" w:hAnsi="Arial"/>
+                <w:sz w:val="20"/>
+                <w:szCs w:val="20"/>
+              </w:rPr>
+              <w:t xml:space="preserve">lead_agent.py</w:t>
+            </w:r>
+          </w:p>
+        </w:tc>
+        <w:tc>
+          <w:tcPr>
+            <w:tcW w:type="dxa" w:w="5760"/>
+            <w:tcBorders>
+              <w:top w:val="single" w:color="CCCCCC" w:sz="4"/>
+              <w:left w:val="single" w:color="CCCCCC" w:sz="4"/>
+              <w:bottom w:val="single" w:color="CCCCCC" w:sz="4"/>
+              <w:right w:val="single" w:color="CCCCCC" w:sz="4"/>
+            </w:tcBorders>
+            <w:shd w:fill="FFFFFF" w:val="clear"/>
+            <w:tcMar>
+              <w:top w:type="dxa" w:w="80"/>
+              <w:left w:type="dxa" w:w="120"/>
+              <w:bottom w:type="dxa" w:w="80"/>
+              <w:right w:type="dxa" w:w="120"/>
+            </w:tcMar>
+          </w:tcPr>
+          <w:p>
+            <w:r>
+              <w:rPr>
+                <w:rFonts w:ascii="Arial" w:cs="Arial" w:eastAsia="Arial" w:hAnsi="Arial"/>
+                <w:sz w:val="20"/>
+                <w:szCs w:val="20"/>
+              </w:rPr>
+              <w:t xml:space="preserve">Bing+Brave + catalogs → leads + contacts</w:t>
+            </w:r>
+          </w:p>
+        </w:tc>
+      </w:tr>
+      <w:tr>
+        <w:tc>
+          <w:tcPr>
+            <w:tcW w:type="dxa" w:w="1200"/>
+            <w:tcBorders>
+              <w:top w:val="single" w:color="CCCCCC" w:sz="4"/>
+              <w:left w:val="single" w:color="CCCCCC" w:sz="4"/>
+              <w:bottom w:val="single" w:color="CCCCCC" w:sz="4"/>
+              <w:right w:val="single" w:color="CCCCCC" w:sz="4"/>
+            </w:tcBorders>
+            <w:shd w:fill="F2F2F2" w:val="clear"/>
+            <w:tcMar>
+              <w:top w:type="dxa" w:w="80"/>
+              <w:left w:type="dxa" w:w="120"/>
+              <w:bottom w:type="dxa" w:w="80"/>
+              <w:right w:type="dxa" w:w="120"/>
+            </w:tcMar>
+          </w:tcPr>
+          <w:p>
+            <w:r>
+              <w:rPr>
+                <w:rFonts w:ascii="Arial" w:cs="Arial" w:eastAsia="Arial" w:hAnsi="Arial"/>
+                <w:sz w:val="20"/>
+                <w:szCs w:val="20"/>
+              </w:rPr>
+              <w:t xml:space="preserve">2 — Classify</w:t>
+            </w:r>
+          </w:p>
+        </w:tc>
+        <w:tc>
+          <w:tcPr>
+            <w:tcW w:type="dxa" w:w="2400"/>
+            <w:tcBorders>
+              <w:top w:val="single" w:color="CCCCCC" w:sz="4"/>
+              <w:left w:val="single" w:color="CCCCCC" w:sz="4"/>
+              <w:bottom w:val="single" w:color="CCCCCC" w:sz="4"/>
+              <w:right w:val="single" w:color="CCCCCC" w:sz="4"/>
+            </w:tcBorders>
+            <w:shd w:fill="F2F2F2" w:val="clear"/>
+            <w:tcMar>
+              <w:top w:type="dxa" w:w="80"/>
+              <w:left w:type="dxa" w:w="120"/>
+              <w:bottom w:type="dxa" w:w="80"/>
+              <w:right w:type="dxa" w:w="120"/>
+            </w:tcMar>
+          </w:tcPr>
+          <w:p>
+            <w:r>
+              <w:rPr>
+                <w:rFonts w:ascii="Arial" w:cs="Arial" w:eastAsia="Arial" w:hAnsi="Arial"/>
+                <w:sz w:val="20"/>
+                <w:szCs w:val="20"/>
+              </w:rPr>
+              <w:t xml:space="preserve">lead_enrich_agent.py</w:t>
+            </w:r>
+          </w:p>
+        </w:tc>
+        <w:tc>
+          <w:tcPr>
+            <w:tcW w:type="dxa" w:w="5760"/>
+            <w:tcBorders>
+              <w:top w:val="single" w:color="CCCCCC" w:sz="4"/>
+              <w:left w:val="single" w:color="CCCCCC" w:sz="4"/>
+              <w:bottom w:val="single" w:color="CCCCCC" w:sz="4"/>
+              <w:right w:val="single" w:color="CCCCCC" w:sz="4"/>
+            </w:tcBorders>
+            <w:shd w:fill="F2F2F2" w:val="clear"/>
+            <w:tcMar>
+              <w:top w:type="dxa" w:w="80"/>
+              <w:left w:type="dxa" w:w="120"/>
+              <w:bottom w:type="dxa" w:w="80"/>
+              <w:right w:type="dxa" w:w="120"/>
+            </w:tcMar>
+          </w:tcPr>
+          <w:p>
+            <w:r>
+              <w:rPr>
+                <w:rFonts w:ascii="Arial" w:cs="Arial" w:eastAsia="Arial" w:hAnsi="Arial"/>
+                <w:sz w:val="20"/>
+                <w:szCs w:val="20"/>
+              </w:rPr>
+              <w:t xml:space="preserve">sector, specialisation, reseller_potential, score</w:t>
+            </w:r>
+          </w:p>
+        </w:tc>
+      </w:tr>
+      <w:tr>
+        <w:tc>
+          <w:tcPr>
+            <w:tcW w:type="dxa" w:w="1200"/>
+            <w:tcBorders>
+              <w:top w:val="single" w:color="CCCCCC" w:sz="4"/>
+              <w:left w:val="single" w:color="CCCCCC" w:sz="4"/>
+              <w:bottom w:val="single" w:color="CCCCCC" w:sz="4"/>
+              <w:right w:val="single" w:color="CCCCCC" w:sz="4"/>
+            </w:tcBorders>
+            <w:shd w:fill="FFFFFF" w:val="clear"/>
+            <w:tcMar>
+              <w:top w:type="dxa" w:w="80"/>
+              <w:left w:type="dxa" w:w="120"/>
+              <w:bottom w:type="dxa" w:w="80"/>
+              <w:right w:type="dxa" w:w="120"/>
+            </w:tcMar>
+          </w:tcPr>
+          <w:p>
+            <w:r>
+              <w:rPr>
+                <w:rFonts w:ascii="Arial" w:cs="Arial" w:eastAsia="Arial" w:hAnsi="Arial"/>
+                <w:sz w:val="20"/>
+                <w:szCs w:val="20"/>
+              </w:rPr>
+              <w:t xml:space="preserve">3 — Enrich contacts</w:t>
+            </w:r>
+          </w:p>
+        </w:tc>
+        <w:tc>
+          <w:tcPr>
+            <w:tcW w:type="dxa" w:w="2400"/>
+            <w:tcBorders>
+              <w:top w:val="single" w:color="CCCCCC" w:sz="4"/>
+              <w:left w:val="single" w:color="CCCCCC" w:sz="4"/>
+              <w:bottom w:val="single" w:color="CCCCCC" w:sz="4"/>
+              <w:right w:val="single" w:color="CCCCCC" w:sz="4"/>
+            </w:tcBorders>
+            <w:shd w:fill="FFFFFF" w:val="clear"/>
+            <w:tcMar>
+              <w:top w:type="dxa" w:w="80"/>
+              <w:left w:type="dxa" w:w="120"/>
+              <w:bottom w:type="dxa" w:w="80"/>
+              <w:right w:type="dxa" w:w="120"/>
+            </w:tcMar>
+          </w:tcPr>
+          <w:p>
+            <w:r>
+              <w:rPr>
+                <w:rFonts w:ascii="Arial" w:cs="Arial" w:eastAsia="Arial" w:hAnsi="Arial"/>
+                <w:sz w:val="20"/>
+                <w:szCs w:val="20"/>
+              </w:rPr>
+              <w:t xml:space="preserve">lead_enrich_contacts.py</w:t>
+            </w:r>
+          </w:p>
+        </w:tc>
+        <w:tc>
+          <w:tcPr>
+            <w:tcW w:type="dxa" w:w="5760"/>
+            <w:tcBorders>
+              <w:top w:val="single" w:color="CCCCCC" w:sz="4"/>
+              <w:left w:val="single" w:color="CCCCCC" w:sz="4"/>
+              <w:bottom w:val="single" w:color="CCCCCC" w:sz="4"/>
+              <w:right w:val="single" w:color="CCCCCC" w:sz="4"/>
+            </w:tcBorders>
+            <w:shd w:fill="FFFFFF" w:val="clear"/>
+            <w:tcMar>
+              <w:top w:type="dxa" w:w="80"/>
+              <w:left w:type="dxa" w:w="120"/>
+              <w:bottom w:type="dxa" w:w="80"/>
+              <w:right w:type="dxa" w:w="120"/>
+            </w:tcMar>
+          </w:tcPr>
+          <w:p>
+            <w:r>
+              <w:rPr>
+                <w:rFonts w:ascii="Arial" w:cs="Arial" w:eastAsia="Arial" w:hAnsi="Arial"/>
+                <w:sz w:val="20"/>
+                <w:szCs w:val="20"/>
+              </w:rPr>
+              <w:t xml:space="preserve">LinkedIn, Twitter, social profiles per contact</w:t>
+            </w:r>
+          </w:p>
+        </w:tc>
+      </w:tr>
+      <w:tr>
+        <w:tc>
+          <w:tcPr>
+            <w:tcW w:type="dxa" w:w="1200"/>
+            <w:tcBorders>
+              <w:top w:val="single" w:color="CCCCCC" w:sz="4"/>
+              <w:left w:val="single" w:color="CCCCCC" w:sz="4"/>
+              <w:bottom w:val="single" w:color="CCCCCC" w:sz="4"/>
+              <w:right w:val="single" w:color="CCCCCC" w:sz="4"/>
+            </w:tcBorders>
+            <w:shd w:fill="F2F2F2" w:val="clear"/>
+            <w:tcMar>
+              <w:top w:type="dxa" w:w="80"/>
+              <w:left w:type="dxa" w:w="120"/>
+              <w:bottom w:type="dxa" w:w="80"/>
+              <w:right w:type="dxa" w:w="120"/>
+            </w:tcMar>
+          </w:tcPr>
+          <w:p>
+            <w:r>
+              <w:rPr>
+                <w:rFonts w:ascii="Arial" w:cs="Arial" w:eastAsia="Arial" w:hAnsi="Arial"/>
+                <w:sz w:val="20"/>
+                <w:szCs w:val="20"/>
+              </w:rPr>
+              <w:t xml:space="preserve">4 — Email check</w:t>
+            </w:r>
+          </w:p>
+        </w:tc>
+        <w:tc>
+          <w:tcPr>
+            <w:tcW w:type="dxa" w:w="2400"/>
+            <w:tcBorders>
+              <w:top w:val="single" w:color="CCCCCC" w:sz="4"/>
+              <w:left w:val="single" w:color="CCCCCC" w:sz="4"/>
+              <w:bottom w:val="single" w:color="CCCCCC" w:sz="4"/>
+              <w:right w:val="single" w:color="CCCCCC" w:sz="4"/>
+            </w:tcBorders>
+            <w:shd w:fill="F2F2F2" w:val="clear"/>
+            <w:tcMar>
+              <w:top w:type="dxa" w:w="80"/>
+              <w:left w:type="dxa" w:w="120"/>
+              <w:bottom w:type="dxa" w:w="80"/>
+              <w:right w:type="dxa" w:w="120"/>
+            </w:tcMar>
+          </w:tcPr>
+          <w:p>
+            <w:r>
+              <w:rPr>
+                <w:rFonts w:ascii="Arial" w:cs="Arial" w:eastAsia="Arial" w:hAnsi="Arial"/>
+                <w:sz w:val="20"/>
+                <w:szCs w:val="20"/>
+              </w:rPr>
+              <w:t xml:space="preserve">leads_email_check.py</w:t>
+            </w:r>
+          </w:p>
+        </w:tc>
+        <w:tc>
+          <w:tcPr>
+            <w:tcW w:type="dxa" w:w="5760"/>
+            <w:tcBorders>
+              <w:top w:val="single" w:color="CCCCCC" w:sz="4"/>
+              <w:left w:val="single" w:color="CCCCCC" w:sz="4"/>
+              <w:bottom w:val="single" w:color="CCCCCC" w:sz="4"/>
+              <w:right w:val="single" w:color="CCCCCC" w:sz="4"/>
+            </w:tcBorders>
+            <w:shd w:fill="F2F2F2" w:val="clear"/>
+            <w:tcMar>
+              <w:top w:type="dxa" w:w="80"/>
+              <w:left w:type="dxa" w:w="120"/>
+              <w:bottom w:type="dxa" w:w="80"/>
+              <w:right w:type="dxa" w:w="120"/>
+            </w:tcMar>
+          </w:tcPr>
+          <w:p>
+            <w:r>
+              <w:rPr>
+                <w:rFonts w:ascii="Arial" w:cs="Arial" w:eastAsia="Arial" w:hAnsi="Arial"/>
+                <w:sz w:val="20"/>
+                <w:szCs w:val="20"/>
+              </w:rPr>
+              <w:t xml:space="preserve">email_type, contact_type, outreach_priority 1–4</w:t>
+            </w:r>
+          </w:p>
+        </w:tc>
+      </w:tr>
+      <w:tr>
+        <w:tc>
+          <w:tcPr>
+            <w:tcW w:type="dxa" w:w="1200"/>
+            <w:tcBorders>
+              <w:top w:val="single" w:color="CCCCCC" w:sz="4"/>
+              <w:left w:val="single" w:color="CCCCCC" w:sz="4"/>
+              <w:bottom w:val="single" w:color="CCCCCC" w:sz="4"/>
+              <w:right w:val="single" w:color="CCCCCC" w:sz="4"/>
+            </w:tcBorders>
+            <w:shd w:fill="FFFFFF" w:val="clear"/>
+            <w:tcMar>
+              <w:top w:type="dxa" w:w="80"/>
+              <w:left w:type="dxa" w:w="120"/>
+              <w:bottom w:type="dxa" w:w="80"/>
+              <w:right w:type="dxa" w:w="120"/>
+            </w:tcMar>
+          </w:tcPr>
+          <w:p>
+            <w:r>
+              <w:rPr>
+                <w:rFonts w:ascii="Arial" w:cs="Arial" w:eastAsia="Arial" w:hAnsi="Arial"/>
+                <w:sz w:val="20"/>
+                <w:szCs w:val="20"/>
+              </w:rPr>
+              <w:t xml:space="preserve">5 — Export</w:t>
+            </w:r>
+          </w:p>
+        </w:tc>
+        <w:tc>
+          <w:tcPr>
+            <w:tcW w:type="dxa" w:w="2400"/>
+            <w:tcBorders>
+              <w:top w:val="single" w:color="CCCCCC" w:sz="4"/>
+              <w:left w:val="single" w:color="CCCCCC" w:sz="4"/>
+              <w:bottom w:val="single" w:color="CCCCCC" w:sz="4"/>
+              <w:right w:val="single" w:color="CCCCCC" w:sz="4"/>
+            </w:tcBorders>
+            <w:shd w:fill="FFFFFF" w:val="clear"/>
+            <w:tcMar>
+              <w:top w:type="dxa" w:w="80"/>
+              <w:left w:type="dxa" w:w="120"/>
+              <w:bottom w:type="dxa" w:w="80"/>
+              <w:right w:type="dxa" w:w="120"/>
+            </w:tcMar>
+          </w:tcPr>
+          <w:p>
+            <w:r>
+              <w:rPr>
+                <w:rFonts w:ascii="Arial" w:cs="Arial" w:eastAsia="Arial" w:hAnsi="Arial"/>
+                <w:sz w:val="20"/>
+                <w:szCs w:val="20"/>
+              </w:rPr>
+              <w:t xml:space="preserve">leads_smart_export.py --write-contacts</w:t>
+            </w:r>
+          </w:p>
+        </w:tc>
+        <w:tc>
+          <w:tcPr>
+            <w:tcW w:type="dxa" w:w="5760"/>
+            <w:tcBorders>
+              <w:top w:val="single" w:color="CCCCCC" w:sz="4"/>
+              <w:left w:val="single" w:color="CCCCCC" w:sz="4"/>
+              <w:bottom w:val="single" w:color="CCCCCC" w:sz="4"/>
+              <w:right w:val="single" w:color="CCCCCC" w:sz="4"/>
+            </w:tcBorders>
+            <w:shd w:fill="FFFFFF" w:val="clear"/>
+            <w:tcMar>
+              <w:top w:type="dxa" w:w="80"/>
+              <w:left w:type="dxa" w:w="120"/>
+              <w:bottom w:type="dxa" w:w="80"/>
+              <w:right w:type="dxa" w:w="120"/>
+            </w:tcMar>
+          </w:tcPr>
+          <w:p>
+            <w:r>
+              <w:rPr>
+                <w:rFonts w:ascii="Arial" w:cs="Arial" w:eastAsia="Arial" w:hAnsi="Arial"/>
+                <w:sz w:val="20"/>
+                <w:szCs w:val="20"/>
+              </w:rPr>
+              <w:t xml:space="preserve">Tiered Excel + writes to email_contacts</w:t>
+            </w:r>
+          </w:p>
+        </w:tc>
+      </w:tr>
+      <w:tr>
+        <w:tc>
+          <w:tcPr>
+            <w:tcW w:type="dxa" w:w="1200"/>
+            <w:tcBorders>
+              <w:top w:val="single" w:color="CCCCCC" w:sz="4"/>
+              <w:left w:val="single" w:color="CCCCCC" w:sz="4"/>
+              <w:bottom w:val="single" w:color="CCCCCC" w:sz="4"/>
+              <w:right w:val="single" w:color="CCCCCC" w:sz="4"/>
+            </w:tcBorders>
+            <w:shd w:fill="F2F2F2" w:val="clear"/>
+            <w:tcMar>
+              <w:top w:type="dxa" w:w="80"/>
+              <w:left w:type="dxa" w:w="120"/>
+              <w:bottom w:type="dxa" w:w="80"/>
+              <w:right w:type="dxa" w:w="120"/>
+            </w:tcMar>
+          </w:tcPr>
+          <w:p>
+            <w:r>
+              <w:rPr>
+                <w:rFonts w:ascii="Arial" w:cs="Arial" w:eastAsia="Arial" w:hAnsi="Arial"/>
+                <w:sz w:val="20"/>
+                <w:szCs w:val="20"/>
+              </w:rPr>
+              <w:t xml:space="preserve">6 — Review</w:t>
+            </w:r>
+          </w:p>
+        </w:tc>
+        <w:tc>
+          <w:tcPr>
+            <w:tcW w:type="dxa" w:w="2400"/>
+            <w:tcBorders>
+              <w:top w:val="single" w:color="CCCCCC" w:sz="4"/>
+              <w:left w:val="single" w:color="CCCCCC" w:sz="4"/>
+              <w:bottom w:val="single" w:color="CCCCCC" w:sz="4"/>
+              <w:right w:val="single" w:color="CCCCCC" w:sz="4"/>
+            </w:tcBorders>
+            <w:shd w:fill="F2F2F2" w:val="clear"/>
+            <w:tcMar>
+              <w:top w:type="dxa" w:w="80"/>
+              <w:left w:type="dxa" w:w="120"/>
+              <w:bottom w:type="dxa" w:w="80"/>
+              <w:right w:type="dxa" w:w="120"/>
+            </w:tcMar>
+          </w:tcPr>
+          <w:p>
+            <w:r>
+              <w:rPr>
+                <w:rFonts w:ascii="Arial" w:cs="Arial" w:eastAsia="Arial" w:hAnsi="Arial"/>
+                <w:sz w:val="20"/>
+                <w:szCs w:val="20"/>
+              </w:rPr>
+              <w:t xml:space="preserve">email_contacts_export.py</w:t>
+            </w:r>
+          </w:p>
+        </w:tc>
+        <w:tc>
+          <w:tcPr>
+            <w:tcW w:type="dxa" w:w="5760"/>
+            <w:tcBorders>
+              <w:top w:val="single" w:color="CCCCCC" w:sz="4"/>
+              <w:left w:val="single" w:color="CCCCCC" w:sz="4"/>
+              <w:bottom w:val="single" w:color="CCCCCC" w:sz="4"/>
+              <w:right w:val="single" w:color="CCCCCC" w:sz="4"/>
+            </w:tcBorders>
+            <w:shd w:fill="F2F2F2" w:val="clear"/>
+            <w:tcMar>
+              <w:top w:type="dxa" w:w="80"/>
+              <w:left w:type="dxa" w:w="120"/>
+              <w:bottom w:type="dxa" w:w="80"/>
+              <w:right w:type="dxa" w:w="120"/>
+            </w:tcMar>
+          </w:tcPr>
+          <w:p>
+            <w:r>
+              <w:rPr>
+                <w:rFonts w:ascii="Arial" w:cs="Arial" w:eastAsia="Arial" w:hAnsi="Arial"/>
+                <w:sz w:val="20"/>
+                <w:szCs w:val="20"/>
+              </w:rPr>
+              <w:t xml:space="preserve">Unified Excel — filter by status, campaign, mark</w:t>
+            </w:r>
+          </w:p>
+        </w:tc>
+      </w:tr>
+    </w:tbl>
+    <w:p>
+      <w:r>
+        <w:t xml:space="preserve"/>
+      </w:r>
+    </w:p>
+    <w:p>
+      <w:pPr>
+        <w:pStyle w:val="Heading2"/>
+      </w:pPr>
+      <w:r>
+        <w:rPr>
+          <w:rFonts w:ascii="Arial" w:cs="Arial" w:eastAsia="Arial" w:hAnsi="Arial"/>
+          <w:b/>
+          <w:bCs/>
+          <w:sz w:val="26"/>
+          <w:szCs w:val="26"/>
+        </w:rPr>
+        <w:t xml:space="preserve">Quick Start — Norway (corrected)</w:t>
+      </w:r>
+    </w:p>
+    <w:p>
+      <w:r>
+        <w:t xml:space="preserve"/>
+      </w:r>
+    </w:p>
+    <w:p>
+      <w:pPr>
+        <w:shd w:fill="F5F5F5" w:val="clear"/>
+        <w:spacing w:after="60"/>
+        <w:ind w:left="480"/>
+      </w:pPr>
+      <w:r>
+        <w:rPr>
+          <w:rFonts w:ascii="Courier New" w:cs="Courier New" w:eastAsia="Courier New" w:hAnsi="Courier New"/>
+          <w:color w:val="1F497D"/>
+          <w:sz w:val="18"/>
+          <w:szCs w:val="18"/>
+        </w:rPr>
+        <w:t xml:space="preserve">python app\lead_agent.py --countries NO --mode both</w:t>
+      </w:r>
+    </w:p>
+    <w:p>
+      <w:pPr>
+        <w:shd w:fill="F5F5F5" w:val="clear"/>
+        <w:spacing w:after="60"/>
+        <w:ind w:left="480"/>
+      </w:pPr>
+      <w:r>
+        <w:rPr>
+          <w:rFonts w:ascii="Courier New" w:cs="Courier New" w:eastAsia="Courier New" w:hAnsi="Courier New"/>
+          <w:color w:val="1F497D"/>
+          <w:sz w:val="18"/>
+          <w:szCs w:val="18"/>
+        </w:rPr>
+        <w:t xml:space="preserve">python app\lead_enrich_agent.py --countries NO</w:t>
+      </w:r>
+    </w:p>
+    <w:p>
+      <w:pPr>
+        <w:shd w:fill="F5F5F5" w:val="clear"/>
+        <w:spacing w:after="60"/>
+        <w:ind w:left="480"/>
+      </w:pPr>
+      <w:r>
+        <w:rPr>
+          <w:rFonts w:ascii="Courier New" w:cs="Courier New" w:eastAsia="Courier New" w:hAnsi="Courier New"/>
+          <w:color w:val="1F497D"/>
+          <w:sz w:val="18"/>
+          <w:szCs w:val="18"/>
+        </w:rPr>
+        <w:t xml:space="preserve">python app\lead_enrich_contacts.py --countries NO --skip-enriched</w:t>
+      </w:r>
+    </w:p>
+    <w:p>
+      <w:pPr>
+        <w:shd w:fill="F5F5F5" w:val="clear"/>
+        <w:spacing w:after="60"/>
+        <w:ind w:left="480"/>
+      </w:pPr>
+      <w:r>
+        <w:rPr>
+          <w:rFonts w:ascii="Courier New" w:cs="Courier New" w:eastAsia="Courier New" w:hAnsi="Courier New"/>
+          <w:color w:val="1F497D"/>
+          <w:sz w:val="18"/>
+          <w:szCs w:val="18"/>
+        </w:rPr>
+        <w:t xml:space="preserve">python app\leads_email_check.py --countries NO --dry-run 20</w:t>
+      </w:r>
+    </w:p>
+    <w:p>
+      <w:pPr>
+        <w:shd w:fill="F5F5F5" w:val="clear"/>
+        <w:spacing w:after="60"/>
+        <w:ind w:left="480"/>
+      </w:pPr>
+      <w:r>
+        <w:rPr>
+          <w:rFonts w:ascii="Courier New" w:cs="Courier New" w:eastAsia="Courier New" w:hAnsi="Courier New"/>
+          <w:color w:val="1F497D"/>
+          <w:sz w:val="18"/>
+          <w:szCs w:val="18"/>
+        </w:rPr>
+        <w:t xml:space="preserve">python app\leads_email_check.py --countries NO</w:t>
+      </w:r>
+    </w:p>
+    <w:p>
+      <w:pPr>
+        <w:shd w:fill="F5F5F5" w:val="clear"/>
+        <w:spacing w:after="60"/>
+        <w:ind w:left="480"/>
+      </w:pPr>
+      <w:r>
+        <w:rPr>
+          <w:rFonts w:ascii="Courier New" w:cs="Courier New" w:eastAsia="Courier New" w:hAnsi="Courier New"/>
+          <w:color w:val="1F497D"/>
+          <w:sz w:val="18"/>
+          <w:szCs w:val="18"/>
+        </w:rPr>
+        <w:t xml:space="preserve">python app\leads_smart_export.py --countries NO --write-contacts --campaign NO_jun02</w:t>
+      </w:r>
+    </w:p>
+    <w:p>
+      <w:pPr>
+        <w:shd w:fill="F5F5F5" w:val="clear"/>
+        <w:spacing w:after="60"/>
+        <w:ind w:left="480"/>
+      </w:pPr>
+      <w:r>
+        <w:rPr>
+          <w:rFonts w:ascii="Courier New" w:cs="Courier New" w:eastAsia="Courier New" w:hAnsi="Courier New"/>
+          <w:color w:val="1F497D"/>
+          <w:sz w:val="18"/>
+          <w:szCs w:val="18"/>
+        </w:rPr>
+        <w:t xml:space="preserve">python app\email_contacts_export.py --countries NO --campaign NO_jun02 --status pending</w:t>
+      </w:r>
+    </w:p>
+    <w:p>
+      <w:r>
+        <w:t xml:space="preserve"/>
+      </w:r>
+    </w:p>
+    <w:p>
+      <w:pPr>
+        <w:pStyle w:val="Heading2"/>
+      </w:pPr>
+      <w:r>
+        <w:rPr>
+          <w:rFonts w:ascii="Arial" w:cs="Arial" w:eastAsia="Arial" w:hAnsi="Arial"/>
+          <w:b/>
+          <w:bCs/>
+          <w:sz w:val="26"/>
+          <w:szCs w:val="26"/>
+        </w:rPr>
+        <w:t xml:space="preserve">leads_email_check.py — CLI Flags</w:t>
+      </w:r>
+    </w:p>
+    <w:p>
+      <w:r>
+        <w:t xml:space="preserve"/>
+      </w:r>
+    </w:p>
+    <w:tbl>
+      <w:tblPr>
+        <w:tblW w:type="dxa" w:w="9360"/>
+        <w:tblBorders>
+          <w:top w:val="single" w:color="auto" w:sz="4"/>
+          <w:left w:val="single" w:color="auto" w:sz="4"/>
+          <w:bottom w:val="single" w:color="auto" w:sz="4"/>
+          <w:right w:val="single" w:color="auto" w:sz="4"/>
+          <w:insideH w:val="single" w:color="auto" w:sz="4"/>
+          <w:insideV w:val="single" w:color="auto" w:sz="4"/>
+        </w:tblBorders>
+      </w:tblPr>
+      <w:tblGrid>
+        <w:gridCol w:w="2000"/>
+        <w:gridCol w:w="1200"/>
+        <w:gridCol w:w="6160"/>
+      </w:tblGrid>
+      <w:tr>
+        <w:trPr>
+          <w:tblHeader/>
+        </w:trPr>
+        <w:tc>
+          <w:tcPr>
+            <w:tcW w:type="dxa" w:w="2000"/>
+            <w:tcBorders>
+              <w:top w:val="single" w:color="1F497D" w:sz="4"/>
+              <w:left w:val="single" w:color="1F497D" w:sz="4"/>
+              <w:bottom w:val="single" w:color="1F497D" w:sz="4"/>
+              <w:right w:val="single" w:color="1F497D" w:sz="4"/>
+            </w:tcBorders>
+            <w:shd w:fill="1F497D" w:val="clear"/>
+            <w:tcMar>
+              <w:top w:type="dxa" w:w="80"/>
+              <w:left w:type="dxa" w:w="120"/>
+              <w:bottom w:type="dxa" w:w="80"/>
+              <w:right w:type="dxa" w:w="120"/>
+            </w:tcMar>
+          </w:tcPr>
+          <w:p>
+            <w:pPr>
+              <w:jc w:val="center"/>
+            </w:pPr>
+            <w:r>
+              <w:rPr>
+                <w:rFonts w:ascii="Arial" w:cs="Arial" w:eastAsia="Arial" w:hAnsi="Arial"/>
+                <w:b/>
+                <w:bCs/>
+                <w:color w:val="FFFFFF"/>
+                <w:sz w:val="20"/>
+                <w:szCs w:val="20"/>
+              </w:rPr>
+              <w:t xml:space="preserve">Flag</w:t>
+            </w:r>
+          </w:p>
+        </w:tc>
+        <w:tc>
+          <w:tcPr>
+            <w:tcW w:type="dxa" w:w="1200"/>
+            <w:tcBorders>
+              <w:top w:val="single" w:color="1F497D" w:sz="4"/>
+              <w:left w:val="single" w:color="1F497D" w:sz="4"/>
+              <w:bottom w:val="single" w:color="1F497D" w:sz="4"/>
+              <w:right w:val="single" w:color="1F497D" w:sz="4"/>
+            </w:tcBorders>
+            <w:shd w:fill="1F497D" w:val="clear"/>
+            <w:tcMar>
+              <w:top w:type="dxa" w:w="80"/>
+              <w:left w:type="dxa" w:w="120"/>
+              <w:bottom w:type="dxa" w:w="80"/>
+              <w:right w:type="dxa" w:w="120"/>
+            </w:tcMar>
+          </w:tcPr>
+          <w:p>
+            <w:pPr>
+              <w:jc w:val="center"/>
+            </w:pPr>
+            <w:r>
+              <w:rPr>
+                <w:rFonts w:ascii="Arial" w:cs="Arial" w:eastAsia="Arial" w:hAnsi="Arial"/>
+                <w:b/>
+                <w:bCs/>
+                <w:color w:val="FFFFFF"/>
+                <w:sz w:val="20"/>
+                <w:szCs w:val="20"/>
+              </w:rPr>
+              <w:t xml:space="preserve">Default</w:t>
+            </w:r>
+          </w:p>
+        </w:tc>
+        <w:tc>
+          <w:tcPr>
+            <w:tcW w:type="dxa" w:w="6160"/>
+            <w:tcBorders>
+              <w:top w:val="single" w:color="1F497D" w:sz="4"/>
+              <w:left w:val="single" w:color="1F497D" w:sz="4"/>
+              <w:bottom w:val="single" w:color="1F497D" w:sz="4"/>
+              <w:right w:val="single" w:color="1F497D" w:sz="4"/>
+            </w:tcBorders>
+            <w:shd w:fill="1F497D" w:val="clear"/>
+            <w:tcMar>
+              <w:top w:type="dxa" w:w="80"/>
+              <w:left w:type="dxa" w:w="120"/>
+              <w:bottom w:type="dxa" w:w="80"/>
+              <w:right w:type="dxa" w:w="120"/>
+            </w:tcMar>
+          </w:tcPr>
+          <w:p>
+            <w:pPr>
+              <w:jc w:val="center"/>
+            </w:pPr>
+            <w:r>
+              <w:rPr>
+                <w:rFonts w:ascii="Arial" w:cs="Arial" w:eastAsia="Arial" w:hAnsi="Arial"/>
+                <w:b/>
+                <w:bCs/>
+                <w:color w:val="FFFFFF"/>
+                <w:sz w:val="20"/>
+                <w:szCs w:val="20"/>
+              </w:rPr>
+              <w:t xml:space="preserve">Description</w:t>
+            </w:r>
+          </w:p>
+        </w:tc>
+      </w:tr>
+      <w:tr>
+        <w:tc>
+          <w:tcPr>
+            <w:tcW w:type="dxa" w:w="2000"/>
+            <w:tcBorders>
+              <w:top w:val="single" w:color="CCCCCC" w:sz="4"/>
+              <w:left w:val="single" w:color="CCCCCC" w:sz="4"/>
+              <w:bottom w:val="single" w:color="CCCCCC" w:sz="4"/>
+              <w:right w:val="single" w:color="CCCCCC" w:sz="4"/>
+            </w:tcBorders>
+            <w:shd w:fill="FFFFFF" w:val="clear"/>
+            <w:tcMar>
+              <w:top w:type="dxa" w:w="80"/>
+              <w:left w:type="dxa" w:w="120"/>
+              <w:bottom w:type="dxa" w:w="80"/>
+              <w:right w:type="dxa" w:w="120"/>
+            </w:tcMar>
+          </w:tcPr>
+          <w:p>
+            <w:r>
+              <w:rPr>
+                <w:rFonts w:ascii="Arial" w:cs="Arial" w:eastAsia="Arial" w:hAnsi="Arial"/>
+                <w:sz w:val="20"/>
+                <w:szCs w:val="20"/>
+              </w:rPr>
+              <w:t xml:space="preserve">--countries</w:t>
+            </w:r>
+          </w:p>
+        </w:tc>
+        <w:tc>
+          <w:tcPr>
+            <w:tcW w:type="dxa" w:w="1200"/>
+            <w:tcBorders>
+              <w:top w:val="single" w:color="CCCCCC" w:sz="4"/>
+              <w:left w:val="single" w:color="CCCCCC" w:sz="4"/>
+              <w:bottom w:val="single" w:color="CCCCCC" w:sz="4"/>
+              <w:right w:val="single" w:color="CCCCCC" w:sz="4"/>
+            </w:tcBorders>
+            <w:shd w:fill="FFFFFF" w:val="clear"/>
+            <w:tcMar>
+              <w:top w:type="dxa" w:w="80"/>
+              <w:left w:type="dxa" w:w="120"/>
+              <w:bottom w:type="dxa" w:w="80"/>
+              <w:right w:type="dxa" w:w="120"/>
+            </w:tcMar>
+          </w:tcPr>
+          <w:p>
+            <w:r>
+              <w:rPr>
+                <w:rFonts w:ascii="Arial" w:cs="Arial" w:eastAsia="Arial" w:hAnsi="Arial"/>
+                <w:sz w:val="20"/>
+                <w:szCs w:val="20"/>
+              </w:rPr>
+              <w:t xml:space="preserve">all</w:t>
+            </w:r>
+          </w:p>
+        </w:tc>
+        <w:tc>
+          <w:tcPr>
+            <w:tcW w:type="dxa" w:w="6160"/>
+            <w:tcBorders>
+              <w:top w:val="single" w:color="CCCCCC" w:sz="4"/>
+              <w:left w:val="single" w:color="CCCCCC" w:sz="4"/>
+              <w:bottom w:val="single" w:color="CCCCCC" w:sz="4"/>
+              <w:right w:val="single" w:color="CCCCCC" w:sz="4"/>
+            </w:tcBorders>
+            <w:shd w:fill="FFFFFF" w:val="clear"/>
+            <w:tcMar>
+              <w:top w:type="dxa" w:w="80"/>
+              <w:left w:type="dxa" w:w="120"/>
+              <w:bottom w:type="dxa" w:w="80"/>
+              <w:right w:type="dxa" w:w="120"/>
+            </w:tcMar>
+          </w:tcPr>
+          <w:p>
+            <w:r>
+              <w:rPr>
+                <w:rFonts w:ascii="Arial" w:cs="Arial" w:eastAsia="Arial" w:hAnsi="Arial"/>
+                <w:sz w:val="20"/>
+                <w:szCs w:val="20"/>
+              </w:rPr>
+              <w:t xml:space="preserve">Space or comma-separated country codes</w:t>
+            </w:r>
+          </w:p>
+        </w:tc>
+      </w:tr>
+      <w:tr>
+        <w:tc>
+          <w:tcPr>
+            <w:tcW w:type="dxa" w:w="2000"/>
+            <w:tcBorders>
+              <w:top w:val="single" w:color="CCCCCC" w:sz="4"/>
+              <w:left w:val="single" w:color="CCCCCC" w:sz="4"/>
+              <w:bottom w:val="single" w:color="CCCCCC" w:sz="4"/>
+              <w:right w:val="single" w:color="CCCCCC" w:sz="4"/>
+            </w:tcBorders>
+            <w:shd w:fill="F2F2F2" w:val="clear"/>
+            <w:tcMar>
+              <w:top w:type="dxa" w:w="80"/>
+              <w:left w:type="dxa" w:w="120"/>
+              <w:bottom w:type="dxa" w:w="80"/>
+              <w:right w:type="dxa" w:w="120"/>
+            </w:tcMar>
+          </w:tcPr>
+          <w:p>
+            <w:r>
+              <w:rPr>
+                <w:rFonts w:ascii="Arial" w:cs="Arial" w:eastAsia="Arial" w:hAnsi="Arial"/>
+                <w:sz w:val="20"/>
+                <w:szCs w:val="20"/>
+              </w:rPr>
+              <w:t xml:space="preserve">--dry-run N</w:t>
+            </w:r>
+          </w:p>
+        </w:tc>
+        <w:tc>
+          <w:tcPr>
+            <w:tcW w:type="dxa" w:w="1200"/>
+            <w:tcBorders>
+              <w:top w:val="single" w:color="CCCCCC" w:sz="4"/>
+              <w:left w:val="single" w:color="CCCCCC" w:sz="4"/>
+              <w:bottom w:val="single" w:color="CCCCCC" w:sz="4"/>
+              <w:right w:val="single" w:color="CCCCCC" w:sz="4"/>
+            </w:tcBorders>
+            <w:shd w:fill="F2F2F2" w:val="clear"/>
+            <w:tcMar>
+              <w:top w:type="dxa" w:w="80"/>
+              <w:left w:type="dxa" w:w="120"/>
+              <w:bottom w:type="dxa" w:w="80"/>
+              <w:right w:type="dxa" w:w="120"/>
+            </w:tcMar>
+          </w:tcPr>
+          <w:p>
+            <w:r>
+              <w:rPr>
+                <w:rFonts w:ascii="Arial" w:cs="Arial" w:eastAsia="Arial" w:hAnsi="Arial"/>
+                <w:sz w:val="20"/>
+                <w:szCs w:val="20"/>
+              </w:rPr>
+              <w:t xml:space="preserve">off</w:t>
+            </w:r>
+          </w:p>
+        </w:tc>
+        <w:tc>
+          <w:tcPr>
+            <w:tcW w:type="dxa" w:w="6160"/>
+            <w:tcBorders>
+              <w:top w:val="single" w:color="CCCCCC" w:sz="4"/>
+              <w:left w:val="single" w:color="CCCCCC" w:sz="4"/>
+              <w:bottom w:val="single" w:color="CCCCCC" w:sz="4"/>
+              <w:right w:val="single" w:color="CCCCCC" w:sz="4"/>
+            </w:tcBorders>
+            <w:shd w:fill="F2F2F2" w:val="clear"/>
+            <w:tcMar>
+              <w:top w:type="dxa" w:w="80"/>
+              <w:left w:type="dxa" w:w="120"/>
+              <w:bottom w:type="dxa" w:w="80"/>
+              <w:right w:type="dxa" w:w="120"/>
+            </w:tcMar>
+          </w:tcPr>
+          <w:p>
+            <w:r>
+              <w:rPr>
+                <w:rFonts w:ascii="Arial" w:cs="Arial" w:eastAsia="Arial" w:hAnsi="Arial"/>
+                <w:sz w:val="20"/>
+                <w:szCs w:val="20"/>
+              </w:rPr>
+              <w:t xml:space="preserve">Run on N contacts, print results, skip writes</w:t>
+            </w:r>
+          </w:p>
+        </w:tc>
+      </w:tr>
+      <w:tr>
+        <w:tc>
+          <w:tcPr>
+            <w:tcW w:type="dxa" w:w="2000"/>
+            <w:tcBorders>
+              <w:top w:val="single" w:color="CCCCCC" w:sz="4"/>
+              <w:left w:val="single" w:color="CCCCCC" w:sz="4"/>
+              <w:bottom w:val="single" w:color="CCCCCC" w:sz="4"/>
+              <w:right w:val="single" w:color="CCCCCC" w:sz="4"/>
+            </w:tcBorders>
+            <w:shd w:fill="FFFFFF" w:val="clear"/>
+            <w:tcMar>
+              <w:top w:type="dxa" w:w="80"/>
+              <w:left w:type="dxa" w:w="120"/>
+              <w:bottom w:type="dxa" w:w="80"/>
+              <w:right w:type="dxa" w:w="120"/>
+            </w:tcMar>
+          </w:tcPr>
+          <w:p>
+            <w:r>
+              <w:rPr>
+                <w:rFonts w:ascii="Arial" w:cs="Arial" w:eastAsia="Arial" w:hAnsi="Arial"/>
+                <w:sz w:val="20"/>
+                <w:szCs w:val="20"/>
+              </w:rPr>
+              <w:t xml:space="preserve">--force</w:t>
+            </w:r>
+          </w:p>
+        </w:tc>
+        <w:tc>
+          <w:tcPr>
+            <w:tcW w:type="dxa" w:w="1200"/>
+            <w:tcBorders>
+              <w:top w:val="single" w:color="CCCCCC" w:sz="4"/>
+              <w:left w:val="single" w:color="CCCCCC" w:sz="4"/>
+              <w:bottom w:val="single" w:color="CCCCCC" w:sz="4"/>
+              <w:right w:val="single" w:color="CCCCCC" w:sz="4"/>
+            </w:tcBorders>
+            <w:shd w:fill="FFFFFF" w:val="clear"/>
+            <w:tcMar>
+              <w:top w:type="dxa" w:w="80"/>
+              <w:left w:type="dxa" w:w="120"/>
+              <w:bottom w:type="dxa" w:w="80"/>
+              <w:right w:type="dxa" w:w="120"/>
+            </w:tcMar>
+          </w:tcPr>
+          <w:p>
+            <w:r>
+              <w:rPr>
+                <w:rFonts w:ascii="Arial" w:cs="Arial" w:eastAsia="Arial" w:hAnsi="Arial"/>
+                <w:sz w:val="20"/>
+                <w:szCs w:val="20"/>
+              </w:rPr>
+              <w:t xml:space="preserve">off</w:t>
+            </w:r>
+          </w:p>
+        </w:tc>
+        <w:tc>
+          <w:tcPr>
+            <w:tcW w:type="dxa" w:w="6160"/>
+            <w:tcBorders>
+              <w:top w:val="single" w:color="CCCCCC" w:sz="4"/>
+              <w:left w:val="single" w:color="CCCCCC" w:sz="4"/>
+              <w:bottom w:val="single" w:color="CCCCCC" w:sz="4"/>
+              <w:right w:val="single" w:color="CCCCCC" w:sz="4"/>
+            </w:tcBorders>
+            <w:shd w:fill="FFFFFF" w:val="clear"/>
+            <w:tcMar>
+              <w:top w:type="dxa" w:w="80"/>
+              <w:left w:type="dxa" w:w="120"/>
+              <w:bottom w:type="dxa" w:w="80"/>
+              <w:right w:type="dxa" w:w="120"/>
+            </w:tcMar>
+          </w:tcPr>
+          <w:p>
+            <w:r>
+              <w:rPr>
+                <w:rFonts w:ascii="Arial" w:cs="Arial" w:eastAsia="Arial" w:hAnsi="Arial"/>
+                <w:sz w:val="20"/>
+                <w:szCs w:val="20"/>
+              </w:rPr>
+              <w:t xml:space="preserve">Re-classify contacts already checked</w:t>
+            </w:r>
+          </w:p>
+        </w:tc>
+      </w:tr>
+      <w:tr>
+        <w:tc>
+          <w:tcPr>
+            <w:tcW w:type="dxa" w:w="2000"/>
+            <w:tcBorders>
+              <w:top w:val="single" w:color="CCCCCC" w:sz="4"/>
+              <w:left w:val="single" w:color="CCCCCC" w:sz="4"/>
+              <w:bottom w:val="single" w:color="CCCCCC" w:sz="4"/>
+              <w:right w:val="single" w:color="CCCCCC" w:sz="4"/>
+            </w:tcBorders>
+            <w:shd w:fill="F2F2F2" w:val="clear"/>
+            <w:tcMar>
+              <w:top w:type="dxa" w:w="80"/>
+              <w:left w:type="dxa" w:w="120"/>
+              <w:bottom w:type="dxa" w:w="80"/>
+              <w:right w:type="dxa" w:w="120"/>
+            </w:tcMar>
+          </w:tcPr>
+          <w:p>
+            <w:r>
+              <w:rPr>
+                <w:rFonts w:ascii="Arial" w:cs="Arial" w:eastAsia="Arial" w:hAnsi="Arial"/>
+                <w:sz w:val="20"/>
+                <w:szCs w:val="20"/>
+              </w:rPr>
+              <w:t xml:space="preserve">--limit N</w:t>
+            </w:r>
+          </w:p>
+        </w:tc>
+        <w:tc>
+          <w:tcPr>
+            <w:tcW w:type="dxa" w:w="1200"/>
+            <w:tcBorders>
+              <w:top w:val="single" w:color="CCCCCC" w:sz="4"/>
+              <w:left w:val="single" w:color="CCCCCC" w:sz="4"/>
+              <w:bottom w:val="single" w:color="CCCCCC" w:sz="4"/>
+              <w:right w:val="single" w:color="CCCCCC" w:sz="4"/>
+            </w:tcBorders>
+            <w:shd w:fill="F2F2F2" w:val="clear"/>
+            <w:tcMar>
+              <w:top w:type="dxa" w:w="80"/>
+              <w:left w:type="dxa" w:w="120"/>
+              <w:bottom w:type="dxa" w:w="80"/>
+              <w:right w:type="dxa" w:w="120"/>
+            </w:tcMar>
+          </w:tcPr>
+          <w:p>
+            <w:r>
+              <w:rPr>
+                <w:rFonts w:ascii="Arial" w:cs="Arial" w:eastAsia="Arial" w:hAnsi="Arial"/>
+                <w:sz w:val="20"/>
+                <w:szCs w:val="20"/>
+              </w:rPr>
+              <w:t xml:space="preserve">none</w:t>
+            </w:r>
+          </w:p>
+        </w:tc>
+        <w:tc>
+          <w:tcPr>
+            <w:tcW w:type="dxa" w:w="6160"/>
+            <w:tcBorders>
+              <w:top w:val="single" w:color="CCCCCC" w:sz="4"/>
+              <w:left w:val="single" w:color="CCCCCC" w:sz="4"/>
+              <w:bottom w:val="single" w:color="CCCCCC" w:sz="4"/>
+              <w:right w:val="single" w:color="CCCCCC" w:sz="4"/>
+            </w:tcBorders>
+            <w:shd w:fill="F2F2F2" w:val="clear"/>
+            <w:tcMar>
+              <w:top w:type="dxa" w:w="80"/>
+              <w:left w:type="dxa" w:w="120"/>
+              <w:bottom w:type="dxa" w:w="80"/>
+              <w:right w:type="dxa" w:w="120"/>
+            </w:tcMar>
+          </w:tcPr>
+          <w:p>
+            <w:r>
+              <w:rPr>
+                <w:rFonts w:ascii="Arial" w:cs="Arial" w:eastAsia="Arial" w:hAnsi="Arial"/>
+                <w:sz w:val="20"/>
+                <w:szCs w:val="20"/>
+              </w:rPr>
+              <w:t xml:space="preserve">Max contacts to process</w:t>
+            </w:r>
+          </w:p>
+        </w:tc>
+      </w:tr>
+      <w:tr>
+        <w:tc>
+          <w:tcPr>
+            <w:tcW w:type="dxa" w:w="2000"/>
+            <w:tcBorders>
+              <w:top w:val="single" w:color="CCCCCC" w:sz="4"/>
+              <w:left w:val="single" w:color="CCCCCC" w:sz="4"/>
+              <w:bottom w:val="single" w:color="CCCCCC" w:sz="4"/>
+              <w:right w:val="single" w:color="CCCCCC" w:sz="4"/>
+            </w:tcBorders>
+            <w:shd w:fill="FFFFFF" w:val="clear"/>
+            <w:tcMar>
+              <w:top w:type="dxa" w:w="80"/>
+              <w:left w:type="dxa" w:w="120"/>
+              <w:bottom w:type="dxa" w:w="80"/>
+              <w:right w:type="dxa" w:w="120"/>
+            </w:tcMar>
+          </w:tcPr>
+          <w:p>
+            <w:r>
+              <w:rPr>
+                <w:rFonts w:ascii="Arial" w:cs="Arial" w:eastAsia="Arial" w:hAnsi="Arial"/>
+                <w:sz w:val="20"/>
+                <w:szCs w:val="20"/>
+              </w:rPr>
+              <w:t xml:space="preserve">--batch-size N</w:t>
+            </w:r>
+          </w:p>
+        </w:tc>
+        <w:tc>
+          <w:tcPr>
+            <w:tcW w:type="dxa" w:w="1200"/>
+            <w:tcBorders>
+              <w:top w:val="single" w:color="CCCCCC" w:sz="4"/>
+              <w:left w:val="single" w:color="CCCCCC" w:sz="4"/>
+              <w:bottom w:val="single" w:color="CCCCCC" w:sz="4"/>
+              <w:right w:val="single" w:color="CCCCCC" w:sz="4"/>
+            </w:tcBorders>
+            <w:shd w:fill="FFFFFF" w:val="clear"/>
+            <w:tcMar>
+              <w:top w:type="dxa" w:w="80"/>
+              <w:left w:type="dxa" w:w="120"/>
+              <w:bottom w:type="dxa" w:w="80"/>
+              <w:right w:type="dxa" w:w="120"/>
+            </w:tcMar>
+          </w:tcPr>
+          <w:p>
+            <w:r>
+              <w:rPr>
+                <w:rFonts w:ascii="Arial" w:cs="Arial" w:eastAsia="Arial" w:hAnsi="Arial"/>
+                <w:sz w:val="20"/>
+                <w:szCs w:val="20"/>
+              </w:rPr>
+              <w:t xml:space="preserve">50</w:t>
+            </w:r>
+          </w:p>
+        </w:tc>
+        <w:tc>
+          <w:tcPr>
+            <w:tcW w:type="dxa" w:w="6160"/>
+            <w:tcBorders>
+              <w:top w:val="single" w:color="CCCCCC" w:sz="4"/>
+              <w:left w:val="single" w:color="CCCCCC" w:sz="4"/>
+              <w:bottom w:val="single" w:color="CCCCCC" w:sz="4"/>
+              <w:right w:val="single" w:color="CCCCCC" w:sz="4"/>
+            </w:tcBorders>
+            <w:shd w:fill="FFFFFF" w:val="clear"/>
+            <w:tcMar>
+              <w:top w:type="dxa" w:w="80"/>
+              <w:left w:type="dxa" w:w="120"/>
+              <w:bottom w:type="dxa" w:w="80"/>
+              <w:right w:type="dxa" w:w="120"/>
+            </w:tcMar>
+          </w:tcPr>
+          <w:p>
+            <w:r>
+              <w:rPr>
+                <w:rFonts w:ascii="Arial" w:cs="Arial" w:eastAsia="Arial" w:hAnsi="Arial"/>
+                <w:sz w:val="20"/>
+                <w:szCs w:val="20"/>
+              </w:rPr>
+              <w:t xml:space="preserve">Contacts per OpenAI call</w:t>
+            </w:r>
+          </w:p>
+        </w:tc>
+      </w:tr>
+      <w:tr>
+        <w:tc>
+          <w:tcPr>
+            <w:tcW w:type="dxa" w:w="2000"/>
+            <w:tcBorders>
+              <w:top w:val="single" w:color="CCCCCC" w:sz="4"/>
+              <w:left w:val="single" w:color="CCCCCC" w:sz="4"/>
+              <w:bottom w:val="single" w:color="CCCCCC" w:sz="4"/>
+              <w:right w:val="single" w:color="CCCCCC" w:sz="4"/>
+            </w:tcBorders>
+            <w:shd w:fill="F2F2F2" w:val="clear"/>
+            <w:tcMar>
+              <w:top w:type="dxa" w:w="80"/>
+              <w:left w:type="dxa" w:w="120"/>
+              <w:bottom w:type="dxa" w:w="80"/>
+              <w:right w:type="dxa" w:w="120"/>
+            </w:tcMar>
+          </w:tcPr>
+          <w:p>
+            <w:r>
+              <w:rPr>
+                <w:rFonts w:ascii="Arial" w:cs="Arial" w:eastAsia="Arial" w:hAnsi="Arial"/>
+                <w:sz w:val="20"/>
+                <w:szCs w:val="20"/>
+              </w:rPr>
+              <w:t xml:space="preserve">--concurrent N</w:t>
+            </w:r>
+          </w:p>
+        </w:tc>
+        <w:tc>
+          <w:tcPr>
+            <w:tcW w:type="dxa" w:w="1200"/>
+            <w:tcBorders>
+              <w:top w:val="single" w:color="CCCCCC" w:sz="4"/>
+              <w:left w:val="single" w:color="CCCCCC" w:sz="4"/>
+              <w:bottom w:val="single" w:color="CCCCCC" w:sz="4"/>
+              <w:right w:val="single" w:color="CCCCCC" w:sz="4"/>
+            </w:tcBorders>
+            <w:shd w:fill="F2F2F2" w:val="clear"/>
+            <w:tcMar>
+              <w:top w:type="dxa" w:w="80"/>
+              <w:left w:type="dxa" w:w="120"/>
+              <w:bottom w:type="dxa" w:w="80"/>
+              <w:right w:type="dxa" w:w="120"/>
+            </w:tcMar>
+          </w:tcPr>
+          <w:p>
+            <w:r>
+              <w:rPr>
+                <w:rFonts w:ascii="Arial" w:cs="Arial" w:eastAsia="Arial" w:hAnsi="Arial"/>
+                <w:sz w:val="20"/>
+                <w:szCs w:val="20"/>
+              </w:rPr>
+              <w:t xml:space="preserve">3</w:t>
+            </w:r>
+          </w:p>
+        </w:tc>
+        <w:tc>
+          <w:tcPr>
+            <w:tcW w:type="dxa" w:w="6160"/>
+            <w:tcBorders>
+              <w:top w:val="single" w:color="CCCCCC" w:sz="4"/>
+              <w:left w:val="single" w:color="CCCCCC" w:sz="4"/>
+              <w:bottom w:val="single" w:color="CCCCCC" w:sz="4"/>
+              <w:right w:val="single" w:color="CCCCCC" w:sz="4"/>
+            </w:tcBorders>
+            <w:shd w:fill="F2F2F2" w:val="clear"/>
+            <w:tcMar>
+              <w:top w:type="dxa" w:w="80"/>
+              <w:left w:type="dxa" w:w="120"/>
+              <w:bottom w:type="dxa" w:w="80"/>
+              <w:right w:type="dxa" w:w="120"/>
+            </w:tcMar>
+          </w:tcPr>
+          <w:p>
+            <w:r>
+              <w:rPr>
+                <w:rFonts w:ascii="Arial" w:cs="Arial" w:eastAsia="Arial" w:hAnsi="Arial"/>
+                <w:sz w:val="20"/>
+                <w:szCs w:val="20"/>
+              </w:rPr>
+              <w:t xml:space="preserve">Parallel OpenAI batch calls</w:t>
+            </w:r>
+          </w:p>
+        </w:tc>
+      </w:tr>
+    </w:tbl>
     <w:sectPr>
       <w:headerReference w:type="default" r:id="rId7"/>
       <w:footerReference w:type="default" r:id="rId8"/>

</xml_diff>